<commit_message>
docs: update final submission verification
</commit_message>
<xml_diff>
--- a/output/report/RentalApp_40535392_Report_Final.docx
+++ b/output/report/RentalApp_40535392_Report_Final.docx
@@ -67,7 +67,7 @@
           <w:color w:val="52606D"/>
           <w:sz w:val="20"/>
         </w:rPr>
-        <w:t>Submission date: 27 July 2026</w:t>
+        <w:t>Submission date: 28 July 2026</w:t>
         <w:br/>
       </w:r>
       <w:r>
@@ -4388,7 +4388,7 @@
                 <w:color w:val="19734C"/>
                 <w:sz w:val="24"/>
               </w:rPr>
-              <w:t>Verified GitHub Actions run - 26 July 2026</w:t>
+              <w:t>Verified GitHub Actions run - 28 July 2026</w:t>
             </w:r>
           </w:p>
           <w:p>
@@ -5366,7 +5366,7 @@
         <w:drawing>
           <wp:inline xmlns:a="http://schemas.openxmlformats.org/drawingml/2006/main" xmlns:pic="http://schemas.openxmlformats.org/drawingml/2006/picture">
             <wp:extent cx="5303520" cy="2651760"/>
-            <wp:docPr id="15" name="Picture 15" descr="Figure 15. API-verified summary of GitHub Actions run #3; both required jobs succeeded." title="Figure 15"/>
+            <wp:docPr id="15" name="Picture 15" descr="Figure 15. API-verified summary of GitHub Actions run #5; both required jobs succeeded." title="Figure 15"/>
             <wp:cNvGraphicFramePr>
               <a:graphicFrameLocks noChangeAspect="1"/>
             </wp:cNvGraphicFramePr>
@@ -5410,7 +5410,7 @@
           <w:color w:val="52606D"/>
           <w:sz w:val="20"/>
         </w:rPr>
-        <w:t>Figure 15. API-verified summary of GitHub Actions run #3; both required jobs succeeded.</w:t>
+        <w:t>Figure 15. API-verified summary of GitHub Actions run #5; both required jobs succeeded.</w:t>
       </w:r>
     </w:p>
     <w:p>
@@ -5448,7 +5448,7 @@
             <w:u w:val="single"/>
             <w:sz w:val="22"/>
           </w:rPr>
-          <w:t>merged pull request #1</w:t>
+          <w:t>merged final pull request #2</w:t>
         </w:r>
       </w:hyperlink>
     </w:p>
@@ -6945,7 +6945,7 @@
                 <w:color w:val="1E293B"/>
                 <w:sz w:val="16"/>
               </w:rPr>
-              <w:t>https://github.com/justinwylie033/RentalApp_40535392 is public; master contains at least 18 reachable commits.</w:t>
+              <w:t>https://github.com/justinwylie033/RentalApp_40535392 is public; master contains at least 20 reachable commits.</w:t>
             </w:r>
           </w:p>
         </w:tc>
@@ -7065,7 +7065,7 @@
                 <w:color w:val="1E293B"/>
                 <w:sz w:val="16"/>
               </w:rPr>
-              <w:t>Run #3 succeeded for backend-tests and android-build; both evidence artifacts exist.</w:t>
+              <w:t>Run #5 succeeded for backend-tests and android-build; both evidence artifacts exist.</w:t>
             </w:r>
           </w:p>
         </w:tc>

</xml_diff>